<commit_message>
Serve Van’s blank agreement as a Word attachment.
Public download is the exact uploaded DOCX from /api/agreement-template. Populated contract PDFs are unchanged.

Co-authored-by: vanpittman12 <vanpittman12@users.noreply.github.com>
</commit_message>
<xml_diff>
--- a/public/agreements/Canaan-Preserve-Relocation-Agreement-template.docx
+++ b/public/agreements/Canaan-Preserve-Relocation-Agreement-template.docx
@@ -1943,27 +1943,31 @@
         <w:rPr>
           <w:sz w:val="24"/>
         </w:rPr>
-        <w:t>($6,000.00)</w:t>
-      </w:r>
-      <w:r>
-        <w:rPr>
-          <w:sz w:val="24"/>
-        </w:rPr>
-      </w:r>
-      <w:r>
-        <w:rPr>
-          <w:sz w:val="24"/>
-        </w:rPr>
-      </w:r>
-      <w:r>
-        <w:rPr>
-          <w:sz w:val="24"/>
-        </w:rPr>
-      </w:r>
-      <w:r>
-        <w:rPr>
-          <w:sz w:val="24"/>
-        </w:rPr>
+        <w:t>($</w:t>
+      </w:r>
+      <w:r>
+        <w:rPr>
+          <w:sz w:val="24"/>
+        </w:rPr>
+        <w:t>5</w:t>
+      </w:r>
+      <w:r>
+        <w:rPr>
+          <w:sz w:val="24"/>
+        </w:rPr>
+        <w:t>,</w:t>
+      </w:r>
+      <w:r>
+        <w:rPr>
+          <w:sz w:val="24"/>
+        </w:rPr>
+        <w:t>75</w:t>
+      </w:r>
+      <w:r>
+        <w:rPr>
+          <w:sz w:val="24"/>
+        </w:rPr>
+        <w:t>0.00)</w:t>
       </w:r>
       <w:r>
         <w:rPr>
@@ -2026,7 +2030,7 @@
           <w:sz w:val="24"/>
           <w:highlight w:val="yellow"/>
         </w:rPr>
-        <w:t>one hundred two thousand dollars</w:t>
+        <w:t>one hundred and twenty thousand dollars</w:t>
       </w:r>
       <w:r>
         <w:rPr>
@@ -5073,32 +5077,37 @@
       <w:r>
         <w:rPr>
           <w:sz w:val="24"/>
-        </w:rPr>
-        <w:t>six thousand dollars ($6,000.00)</w:t>
-      </w:r>
-      <w:r>
-        <w:rPr>
-          <w:sz w:val="24"/>
           <w:highlight w:val="yellow"/>
         </w:rPr>
+        <w:t>six thousand dollars ($</w:t>
       </w:r>
       <w:r>
         <w:rPr>
           <w:sz w:val="24"/>
           <w:highlight w:val="yellow"/>
         </w:rPr>
+        <w:t>5</w:t>
       </w:r>
       <w:r>
         <w:rPr>
           <w:sz w:val="24"/>
           <w:highlight w:val="yellow"/>
         </w:rPr>
+        <w:t>,</w:t>
       </w:r>
       <w:r>
         <w:rPr>
           <w:sz w:val="24"/>
           <w:highlight w:val="yellow"/>
         </w:rPr>
+        <w:t>75</w:t>
+      </w:r>
+      <w:r>
+        <w:rPr>
+          <w:sz w:val="24"/>
+          <w:highlight w:val="yellow"/>
+        </w:rPr>
+        <w:t>0.00)</w:t>
       </w:r>
       <w:r>
         <w:rPr>
@@ -18977,7 +18986,7 @@
                 <w:highlight w:val="yellow"/>
               </w:rPr>
               <w:br/>
-              <w:t>Attention: Contact name</w:t>
+              <w:t xml:space="preserve">Attention: Bob Margeson</w:t>
             </w:r>
             <w:r>
               <w:rPr>
@@ -18992,7 +19001,7 @@
                 <w:highlight w:val="yellow"/>
               </w:rPr>
               <w:br/>
-              <w:t>Street address</w:t>
+              <w:t xml:space="preserve">3025 East South St.</w:t>
             </w:r>
           </w:p>
           <w:p>
@@ -19010,7 +19019,7 @@
                 <w:sz w:val="24"/>
                 <w:highlight w:val="yellow"/>
               </w:rPr>
-              <w:t>City, State ZIP</w:t>
+              <w:t>Orlando,</w:t>
             </w:r>
             <w:r>
               <w:rPr>
@@ -19018,12 +19027,14 @@
                 <w:sz w:val="24"/>
                 <w:highlight w:val="yellow"/>
               </w:rPr>
+              <w:t xml:space="preserve"> </w:t>
             </w:r>
             <w:r>
               <w:rPr>
                 <w:sz w:val="24"/>
                 <w:highlight w:val="yellow"/>
               </w:rPr>
+              <w:t>FL</w:t>
             </w:r>
             <w:r>
               <w:rPr>
@@ -19031,6 +19042,7 @@
                 <w:sz w:val="24"/>
                 <w:highlight w:val="yellow"/>
               </w:rPr>
+              <w:t xml:space="preserve"> </w:t>
             </w:r>
             <w:r>
               <w:rPr>
@@ -19038,6 +19050,7 @@
                 <w:sz w:val="24"/>
                 <w:highlight w:val="yellow"/>
               </w:rPr>
+              <w:t>32803</w:t>
             </w:r>
           </w:p>
           <w:p>
@@ -19054,7 +19067,7 @@
                 <w:sz w:val="24"/>
                 <w:highlight w:val="yellow"/>
               </w:rPr>
-              <w:t>Phone: Phone number</w:t>
+              <w:t>Phone:</w:t>
             </w:r>
             <w:r>
               <w:rPr>
@@ -19062,12 +19075,14 @@
                 <w:sz w:val="24"/>
                 <w:highlight w:val="yellow"/>
               </w:rPr>
+              <w:t xml:space="preserve"> </w:t>
             </w:r>
             <w:r>
               <w:rPr>
                 <w:sz w:val="24"/>
                 <w:highlight w:val="yellow"/>
               </w:rPr>
+              <w:t>407-894-</w:t>
             </w:r>
             <w:r>
               <w:rPr>
@@ -19075,6 +19090,7 @@
                 <w:sz w:val="24"/>
                 <w:highlight w:val="yellow"/>
               </w:rPr>
+              <w:t>5969</w:t>
             </w:r>
           </w:p>
         </w:tc>
@@ -19209,66 +19225,68 @@
               <w:rPr>
                 <w:sz w:val="24"/>
               </w:rPr>
-              <w:t xml:space="preserve"> </w:t>
-            </w:r>
-            <w:r>
-              <w:rPr>
-                <w:sz w:val="24"/>
-                <w:highlight w:val="yellow"/>
-              </w:rPr>
-              <w:t xml:space="preserve">______________</w:t>
+              <w:t xml:space="preserve"> Applied</w:t>
             </w:r>
             <w:r>
               <w:rPr>
                 <w:spacing w:val="-15"/>
                 <w:sz w:val="24"/>
               </w:rPr>
+              <w:t xml:space="preserve"> </w:t>
             </w:r>
             <w:r>
               <w:rPr>
                 <w:sz w:val="24"/>
               </w:rPr>
+              <w:t>Bionomics,</w:t>
             </w:r>
             <w:r>
               <w:rPr>
                 <w:spacing w:val="-15"/>
                 <w:sz w:val="24"/>
               </w:rPr>
+              <w:t xml:space="preserve"> </w:t>
             </w:r>
             <w:r>
               <w:rPr>
                 <w:sz w:val="24"/>
               </w:rPr>
+              <w:t xml:space="preserve">LLC </w:t>
             </w:r>
             <w:r>
               <w:rPr>
                 <w:spacing w:val="-2"/>
                 <w:sz w:val="24"/>
               </w:rPr>
+              <w:t>Attention:</w:t>
             </w:r>
             <w:r>
               <w:rPr>
                 <w:spacing w:val="-13"/>
                 <w:sz w:val="24"/>
               </w:rPr>
+              <w:t xml:space="preserve"> </w:t>
             </w:r>
             <w:r>
               <w:rPr>
                 <w:spacing w:val="-2"/>
                 <w:sz w:val="24"/>
               </w:rPr>
+              <w:t>Andrew</w:t>
             </w:r>
             <w:r>
               <w:rPr>
                 <w:spacing w:val="-15"/>
                 <w:sz w:val="24"/>
               </w:rPr>
+              <w:t xml:space="preserve"> </w:t>
             </w:r>
             <w:r>
               <w:rPr>
                 <w:spacing w:val="-2"/>
                 <w:sz w:val="24"/>
               </w:rPr>
+              <w:t>Fuddy</w:t>
             </w:r>
           </w:p>
           <w:p>
@@ -19284,39 +19302,46 @@
               <w:rPr>
                 <w:sz w:val="24"/>
               </w:rPr>
+              <w:t>3113</w:t>
             </w:r>
             <w:r>
               <w:rPr>
                 <w:spacing w:val="-14"/>
                 <w:sz w:val="24"/>
               </w:rPr>
+              <w:t xml:space="preserve"> </w:t>
             </w:r>
             <w:r>
               <w:rPr>
                 <w:sz w:val="24"/>
               </w:rPr>
+              <w:t>W.</w:t>
             </w:r>
             <w:r>
               <w:rPr>
                 <w:spacing w:val="-14"/>
                 <w:sz w:val="24"/>
               </w:rPr>
+              <w:t xml:space="preserve"> </w:t>
             </w:r>
             <w:r>
               <w:rPr>
                 <w:sz w:val="24"/>
               </w:rPr>
+              <w:t>Fielder</w:t>
             </w:r>
             <w:r>
               <w:rPr>
                 <w:spacing w:val="-14"/>
                 <w:sz w:val="24"/>
               </w:rPr>
+              <w:t xml:space="preserve"> </w:t>
             </w:r>
             <w:r>
               <w:rPr>
                 <w:sz w:val="24"/>
               </w:rPr>
+              <w:t>Street Tampa, FL 33611</w:t>
             </w:r>
           </w:p>
         </w:tc>
@@ -22324,20 +22349,12 @@
                 <w:sz w:val="24"/>
               </w:rPr>
               <w:t>Its:</w:t>
-              <w:tab/>
-            </w:r>
-            <w:r>
-              <w:rPr>
-                <w:spacing w:val="-4"/>
-                <w:sz w:val="24"/>
-                <w:highlight w:val="yellow"/>
-              </w:rPr>
-              <w:t xml:space="preserve">Authorized Agent</w:t>
             </w:r>
             <w:r>
               <w:rPr>
                 <w:sz w:val="24"/>
               </w:rPr>
+              <w:tab/>
             </w:r>
             <w:r>
               <w:rPr>
@@ -22345,6 +22362,7 @@
                 <w:sz w:val="24"/>
                 <w:highlight w:val="yellow"/>
               </w:rPr>
+              <w:t>Manager</w:t>
             </w:r>
           </w:p>
         </w:tc>

</xml_diff>

<commit_message>
Use Van’s updated 66615-byte blank Word agreement.
Keep /api/agreement-template as a Word attachment of those exact bytes. Do not rewrite the DOCX.

Co-authored-by: vanpittman12 <vanpittman12@users.noreply.github.com>
</commit_message>
<xml_diff>
--- a/public/agreements/Canaan-Preserve-Relocation-Agreement-template.docx
+++ b/public/agreements/Canaan-Preserve-Relocation-Agreement-template.docx
@@ -1943,31 +1943,27 @@
         <w:rPr>
           <w:sz w:val="24"/>
         </w:rPr>
-        <w:t>($</w:t>
-      </w:r>
-      <w:r>
-        <w:rPr>
-          <w:sz w:val="24"/>
-        </w:rPr>
-        <w:t>5</w:t>
-      </w:r>
-      <w:r>
-        <w:rPr>
-          <w:sz w:val="24"/>
-        </w:rPr>
-        <w:t>,</w:t>
-      </w:r>
-      <w:r>
-        <w:rPr>
-          <w:sz w:val="24"/>
-        </w:rPr>
-        <w:t>75</w:t>
-      </w:r>
-      <w:r>
-        <w:rPr>
-          <w:sz w:val="24"/>
-        </w:rPr>
-        <w:t>0.00)</w:t>
+        <w:t>($6,000.00)</w:t>
+      </w:r>
+      <w:r>
+        <w:rPr>
+          <w:sz w:val="24"/>
+        </w:rPr>
+      </w:r>
+      <w:r>
+        <w:rPr>
+          <w:sz w:val="24"/>
+        </w:rPr>
+      </w:r>
+      <w:r>
+        <w:rPr>
+          <w:sz w:val="24"/>
+        </w:rPr>
+      </w:r>
+      <w:r>
+        <w:rPr>
+          <w:sz w:val="24"/>
+        </w:rPr>
       </w:r>
       <w:r>
         <w:rPr>
@@ -2030,7 +2026,7 @@
           <w:sz w:val="24"/>
           <w:highlight w:val="yellow"/>
         </w:rPr>
-        <w:t>one hundred and twenty thousand dollars</w:t>
+        <w:t>one hundred two thousand dollars</w:t>
       </w:r>
       <w:r>
         <w:rPr>
@@ -5077,37 +5073,32 @@
       <w:r>
         <w:rPr>
           <w:sz w:val="24"/>
+        </w:rPr>
+        <w:t>six thousand dollars ($6,000.00)</w:t>
+      </w:r>
+      <w:r>
+        <w:rPr>
+          <w:sz w:val="24"/>
           <w:highlight w:val="yellow"/>
         </w:rPr>
-        <w:t>six thousand dollars ($</w:t>
       </w:r>
       <w:r>
         <w:rPr>
           <w:sz w:val="24"/>
           <w:highlight w:val="yellow"/>
         </w:rPr>
-        <w:t>5</w:t>
       </w:r>
       <w:r>
         <w:rPr>
           <w:sz w:val="24"/>
           <w:highlight w:val="yellow"/>
         </w:rPr>
-        <w:t>,</w:t>
       </w:r>
       <w:r>
         <w:rPr>
           <w:sz w:val="24"/>
           <w:highlight w:val="yellow"/>
         </w:rPr>
-        <w:t>75</w:t>
-      </w:r>
-      <w:r>
-        <w:rPr>
-          <w:sz w:val="24"/>
-          <w:highlight w:val="yellow"/>
-        </w:rPr>
-        <w:t>0.00)</w:t>
       </w:r>
       <w:r>
         <w:rPr>
@@ -18986,7 +18977,7 @@
                 <w:highlight w:val="yellow"/>
               </w:rPr>
               <w:br/>
-              <w:t xml:space="preserve">Attention: Bob Margeson</w:t>
+              <w:t>Attention: Contact name</w:t>
             </w:r>
             <w:r>
               <w:rPr>
@@ -19001,7 +18992,7 @@
                 <w:highlight w:val="yellow"/>
               </w:rPr>
               <w:br/>
-              <w:t xml:space="preserve">3025 East South St.</w:t>
+              <w:t>Street address</w:t>
             </w:r>
           </w:p>
           <w:p>
@@ -19019,7 +19010,7 @@
                 <w:sz w:val="24"/>
                 <w:highlight w:val="yellow"/>
               </w:rPr>
-              <w:t>Orlando,</w:t>
+              <w:t>City, State ZIP</w:t>
             </w:r>
             <w:r>
               <w:rPr>
@@ -19027,14 +19018,12 @@
                 <w:sz w:val="24"/>
                 <w:highlight w:val="yellow"/>
               </w:rPr>
-              <w:t xml:space="preserve"> </w:t>
             </w:r>
             <w:r>
               <w:rPr>
                 <w:sz w:val="24"/>
                 <w:highlight w:val="yellow"/>
               </w:rPr>
-              <w:t>FL</w:t>
             </w:r>
             <w:r>
               <w:rPr>
@@ -19042,7 +19031,6 @@
                 <w:sz w:val="24"/>
                 <w:highlight w:val="yellow"/>
               </w:rPr>
-              <w:t xml:space="preserve"> </w:t>
             </w:r>
             <w:r>
               <w:rPr>
@@ -19050,7 +19038,6 @@
                 <w:sz w:val="24"/>
                 <w:highlight w:val="yellow"/>
               </w:rPr>
-              <w:t>32803</w:t>
             </w:r>
           </w:p>
           <w:p>
@@ -19067,7 +19054,7 @@
                 <w:sz w:val="24"/>
                 <w:highlight w:val="yellow"/>
               </w:rPr>
-              <w:t>Phone:</w:t>
+              <w:t>Phone: Phone number</w:t>
             </w:r>
             <w:r>
               <w:rPr>
@@ -19075,14 +19062,12 @@
                 <w:sz w:val="24"/>
                 <w:highlight w:val="yellow"/>
               </w:rPr>
-              <w:t xml:space="preserve"> </w:t>
             </w:r>
             <w:r>
               <w:rPr>
                 <w:sz w:val="24"/>
                 <w:highlight w:val="yellow"/>
               </w:rPr>
-              <w:t>407-894-</w:t>
             </w:r>
             <w:r>
               <w:rPr>
@@ -19090,7 +19075,6 @@
                 <w:sz w:val="24"/>
                 <w:highlight w:val="yellow"/>
               </w:rPr>
-              <w:t>5969</w:t>
             </w:r>
           </w:p>
         </w:tc>
@@ -19225,68 +19209,66 @@
               <w:rPr>
                 <w:sz w:val="24"/>
               </w:rPr>
-              <w:t xml:space="preserve"> Applied</w:t>
+              <w:t xml:space="preserve"> </w:t>
+            </w:r>
+            <w:r>
+              <w:rPr>
+                <w:sz w:val="24"/>
+                <w:highlight w:val="yellow"/>
+              </w:rPr>
+              <w:t xml:space="preserve">______________</w:t>
             </w:r>
             <w:r>
               <w:rPr>
                 <w:spacing w:val="-15"/>
                 <w:sz w:val="24"/>
               </w:rPr>
-              <w:t xml:space="preserve"> </w:t>
             </w:r>
             <w:r>
               <w:rPr>
                 <w:sz w:val="24"/>
               </w:rPr>
-              <w:t>Bionomics,</w:t>
             </w:r>
             <w:r>
               <w:rPr>
                 <w:spacing w:val="-15"/>
                 <w:sz w:val="24"/>
               </w:rPr>
-              <w:t xml:space="preserve"> </w:t>
             </w:r>
             <w:r>
               <w:rPr>
                 <w:sz w:val="24"/>
               </w:rPr>
-              <w:t xml:space="preserve">LLC </w:t>
             </w:r>
             <w:r>
               <w:rPr>
                 <w:spacing w:val="-2"/>
                 <w:sz w:val="24"/>
               </w:rPr>
-              <w:t>Attention:</w:t>
             </w:r>
             <w:r>
               <w:rPr>
                 <w:spacing w:val="-13"/>
                 <w:sz w:val="24"/>
               </w:rPr>
-              <w:t xml:space="preserve"> </w:t>
             </w:r>
             <w:r>
               <w:rPr>
                 <w:spacing w:val="-2"/>
                 <w:sz w:val="24"/>
               </w:rPr>
-              <w:t>Andrew</w:t>
             </w:r>
             <w:r>
               <w:rPr>
                 <w:spacing w:val="-15"/>
                 <w:sz w:val="24"/>
               </w:rPr>
-              <w:t xml:space="preserve"> </w:t>
             </w:r>
             <w:r>
               <w:rPr>
                 <w:spacing w:val="-2"/>
                 <w:sz w:val="24"/>
               </w:rPr>
-              <w:t>Fuddy</w:t>
             </w:r>
           </w:p>
           <w:p>
@@ -19302,46 +19284,39 @@
               <w:rPr>
                 <w:sz w:val="24"/>
               </w:rPr>
-              <w:t>3113</w:t>
             </w:r>
             <w:r>
               <w:rPr>
                 <w:spacing w:val="-14"/>
                 <w:sz w:val="24"/>
               </w:rPr>
-              <w:t xml:space="preserve"> </w:t>
             </w:r>
             <w:r>
               <w:rPr>
                 <w:sz w:val="24"/>
               </w:rPr>
-              <w:t>W.</w:t>
             </w:r>
             <w:r>
               <w:rPr>
                 <w:spacing w:val="-14"/>
                 <w:sz w:val="24"/>
               </w:rPr>
-              <w:t xml:space="preserve"> </w:t>
             </w:r>
             <w:r>
               <w:rPr>
                 <w:sz w:val="24"/>
               </w:rPr>
-              <w:t>Fielder</w:t>
             </w:r>
             <w:r>
               <w:rPr>
                 <w:spacing w:val="-14"/>
                 <w:sz w:val="24"/>
               </w:rPr>
-              <w:t xml:space="preserve"> </w:t>
             </w:r>
             <w:r>
               <w:rPr>
                 <w:sz w:val="24"/>
               </w:rPr>
-              <w:t>Street Tampa, FL 33611</w:t>
             </w:r>
           </w:p>
         </w:tc>
@@ -22349,12 +22324,20 @@
                 <w:sz w:val="24"/>
               </w:rPr>
               <w:t>Its:</w:t>
+              <w:tab/>
+            </w:r>
+            <w:r>
+              <w:rPr>
+                <w:spacing w:val="-4"/>
+                <w:sz w:val="24"/>
+                <w:highlight w:val="yellow"/>
+              </w:rPr>
+              <w:t xml:space="preserve">Authorized Agent</w:t>
             </w:r>
             <w:r>
               <w:rPr>
                 <w:sz w:val="24"/>
               </w:rPr>
-              <w:tab/>
             </w:r>
             <w:r>
               <w:rPr>
@@ -22362,7 +22345,6 @@
                 <w:sz w:val="24"/>
                 <w:highlight w:val="yellow"/>
               </w:rPr>
-              <w:t>Manager</w:t>
             </w:r>
           </w:p>
         </w:tc>

</xml_diff>

<commit_message>
Show highlighted Project Name on the blank agreement subtitle.
Replace the Heading2 leftover under GOPHER TORTOISE RELOCATION AGREEMENT so downloaders see an active fill field, and match that leftover when populate stamps the intake project name.

Co-authored-by: vanpittman12 <vanpittman12@users.noreply.github.com>
</commit_message>
<xml_diff>
--- a/public/agreements/Canaan-Preserve-Relocation-Agreement-template.docx
+++ b/public/agreements/Canaan-Preserve-Relocation-Agreement-template.docx
@@ -93,7 +93,10 @@
         <w:jc w:val="center"/>
       </w:pPr>
       <w:r>
-        <w:t>Multi-Project Relocation Agreement</w:t>
+        <w:rPr>
+          <w:highlight w:val="yellow"/>
+        </w:rPr>
+        <w:t>Project Name</w:t>
       </w:r>
     </w:p>
     <w:p>

</xml_diff>

<commit_message>
Show highlighted Project Name on the blank agreement subtitle. (#59)
Replace the Heading2 leftover under GOPHER TORTOISE RELOCATION AGREEMENT so downloaders see an active fill field, and match that leftover when populate stamps the intake project name.

Co-authored-by: Cursor Agent <cursoragent@cursor.com>
Co-authored-by: vanpittman12 <vanpittman12@users.noreply.github.com>
</commit_message>
<xml_diff>
--- a/public/agreements/Canaan-Preserve-Relocation-Agreement-template.docx
+++ b/public/agreements/Canaan-Preserve-Relocation-Agreement-template.docx
@@ -93,7 +93,10 @@
         <w:jc w:val="center"/>
       </w:pPr>
       <w:r>
-        <w:t>Multi-Project Relocation Agreement</w:t>
+        <w:rPr>
+          <w:highlight w:val="yellow"/>
+        </w:rPr>
+        <w:t>Project Name</w:t>
       </w:r>
     </w:p>
     <w:p>

</xml_diff>